<commit_message>
docs: detail third DSRL training changes
</commit_message>
<xml_diff>
--- a/weekly_report_2026-08-26/TacEx_weekly_report_2026-08-20_to_2026-08-26.docx
+++ b/weekly_report_2026-08-26/TacEx_weekly_report_2026-08-20_to_2026-08-26.docx
@@ -278,7 +278,729 @@
           <w:color w:val="2F5496"/>
           <w:sz w:val="24"/>
         </w:rPr>
-        <w:t>2.3 三组训练数据</w:t>
+        <w:t>2.3 训练3相对前两条的具体改动</w:t>
+      </w:r>
+    </w:p>
+    <w:p>
+      <w:pPr>
+        <w:spacing w:after="50" w:line="276" w:lineRule="auto"/>
+        <w:ind w:left="113"/>
+      </w:pPr>
+      <w:r>
+        <w:rPr>
+          <w:rFonts w:ascii="Arial" w:hAnsi="Arial" w:eastAsia="Microsoft YaHei"/>
+          <w:sz w:val="21"/>
+        </w:rPr>
+        <w:t>• 训练3不是从训练1或训练2续训，而是使用冻结BC重新初始化SAC，seed=45；前两条分别使用seed=42和seed=43。</w:t>
+      </w:r>
+    </w:p>
+    <w:tbl>
+      <w:tblPr>
+        <w:tblStyle w:val="TableGrid"/>
+        <w:tblW w:type="auto" w:w="0"/>
+        <w:jc w:val="center"/>
+        <w:tblLook w:firstColumn="1" w:firstRow="1" w:lastColumn="0" w:lastRow="0" w:noHBand="0" w:noVBand="1" w:val="04A0"/>
+      </w:tblPr>
+      <w:tblGrid>
+        <w:gridCol w:w="2550"/>
+        <w:gridCol w:w="2550"/>
+        <w:gridCol w:w="2550"/>
+        <w:gridCol w:w="2550"/>
+      </w:tblGrid>
+      <w:tr>
+        <w:tc>
+          <w:tcPr>
+            <w:tcW w:type="dxa" w:w="2550"/>
+            <w:shd w:fill="4472C4"/>
+            <w:vAlign w:val="center"/>
+          </w:tcPr>
+          <w:p>
+            <w:pPr>
+              <w:jc w:val="center"/>
+            </w:pPr>
+            <w:r/>
+            <w:r>
+              <w:rPr>
+                <w:rFonts w:ascii="Arial" w:hAnsi="Arial" w:eastAsia="Microsoft YaHei"/>
+                <w:b/>
+                <w:color w:val="FFFFFF"/>
+                <w:sz w:val="17"/>
+              </w:rPr>
+              <w:t>配置项</w:t>
+            </w:r>
+          </w:p>
+        </w:tc>
+        <w:tc>
+          <w:tcPr>
+            <w:tcW w:type="dxa" w:w="2550"/>
+            <w:shd w:fill="4472C4"/>
+            <w:vAlign w:val="center"/>
+          </w:tcPr>
+          <w:p>
+            <w:pPr>
+              <w:jc w:val="center"/>
+            </w:pPr>
+            <w:r/>
+            <w:r>
+              <w:rPr>
+                <w:rFonts w:ascii="Arial" w:hAnsi="Arial" w:eastAsia="Microsoft YaHei"/>
+                <w:b/>
+                <w:color w:val="FFFFFF"/>
+                <w:sz w:val="17"/>
+              </w:rPr>
+              <w:t>训练1/2</w:t>
+            </w:r>
+          </w:p>
+        </w:tc>
+        <w:tc>
+          <w:tcPr>
+            <w:tcW w:type="dxa" w:w="2550"/>
+            <w:shd w:fill="4472C4"/>
+            <w:vAlign w:val="center"/>
+          </w:tcPr>
+          <w:p>
+            <w:pPr>
+              <w:jc w:val="center"/>
+            </w:pPr>
+            <w:r/>
+            <w:r>
+              <w:rPr>
+                <w:rFonts w:ascii="Arial" w:hAnsi="Arial" w:eastAsia="Microsoft YaHei"/>
+                <w:b/>
+                <w:color w:val="FFFFFF"/>
+                <w:sz w:val="17"/>
+              </w:rPr>
+              <w:t>训练3</w:t>
+            </w:r>
+          </w:p>
+        </w:tc>
+        <w:tc>
+          <w:tcPr>
+            <w:tcW w:type="dxa" w:w="2550"/>
+            <w:shd w:fill="4472C4"/>
+            <w:vAlign w:val="center"/>
+          </w:tcPr>
+          <w:p>
+            <w:pPr>
+              <w:jc w:val="center"/>
+            </w:pPr>
+            <w:r/>
+            <w:r>
+              <w:rPr>
+                <w:rFonts w:ascii="Arial" w:hAnsi="Arial" w:eastAsia="Microsoft YaHei"/>
+                <w:b/>
+                <w:color w:val="FFFFFF"/>
+                <w:sz w:val="17"/>
+              </w:rPr>
+              <w:t>改动目的</w:t>
+            </w:r>
+          </w:p>
+        </w:tc>
+      </w:tr>
+      <w:tr>
+        <w:tc>
+          <w:tcPr>
+            <w:tcW w:type="dxa" w:w="2550"/>
+            <w:vAlign w:val="center"/>
+          </w:tcPr>
+          <w:p>
+            <w:pPr>
+              <w:jc w:val="center"/>
+            </w:pPr>
+            <w:r/>
+            <w:r>
+              <w:rPr>
+                <w:rFonts w:ascii="Arial" w:hAnsi="Arial" w:eastAsia="Microsoft YaHei"/>
+                <w:b w:val="0"/>
+                <w:sz w:val="16"/>
+              </w:rPr>
+              <w:t>超时处理</w:t>
+            </w:r>
+          </w:p>
+        </w:tc>
+        <w:tc>
+          <w:tcPr>
+            <w:tcW w:type="dxa" w:w="2550"/>
+            <w:vAlign w:val="center"/>
+          </w:tcPr>
+          <w:p>
+            <w:pPr>
+              <w:jc w:val="center"/>
+            </w:pPr>
+            <w:r/>
+            <w:r>
+              <w:rPr>
+                <w:rFonts w:ascii="Arial" w:hAnsi="Arial" w:eastAsia="Microsoft YaHei"/>
+                <w:b w:val="0"/>
+                <w:sz w:val="16"/>
+              </w:rPr>
+              <w:t>未显式启用终止修复</w:t>
+            </w:r>
+          </w:p>
+        </w:tc>
+        <w:tc>
+          <w:tcPr>
+            <w:tcW w:type="dxa" w:w="2550"/>
+            <w:vAlign w:val="center"/>
+          </w:tcPr>
+          <w:p>
+            <w:pPr>
+              <w:jc w:val="center"/>
+            </w:pPr>
+            <w:r/>
+            <w:r>
+              <w:rPr>
+                <w:rFonts w:ascii="Arial" w:hAnsi="Arial" w:eastAsia="Microsoft YaHei"/>
+                <w:b w:val="0"/>
+                <w:sz w:val="16"/>
+              </w:rPr>
+              <w:t>显式</w:t>
+              <w:br/>
+              <w:t>--sac_terminal_timeouts</w:t>
+            </w:r>
+          </w:p>
+        </w:tc>
+        <w:tc>
+          <w:tcPr>
+            <w:tcW w:type="dxa" w:w="2550"/>
+            <w:vAlign w:val="center"/>
+          </w:tcPr>
+          <w:p>
+            <w:pPr>
+              <w:jc w:val="center"/>
+            </w:pPr>
+            <w:r/>
+            <w:r>
+              <w:rPr>
+                <w:rFonts w:ascii="Arial" w:hAnsi="Arial" w:eastAsia="Microsoft YaHei"/>
+                <w:b w:val="0"/>
+                <w:sz w:val="16"/>
+              </w:rPr>
+              <w:t>把失败超时作为terminal，禁止从自动reset观测进行Q值自举</w:t>
+            </w:r>
+          </w:p>
+        </w:tc>
+      </w:tr>
+      <w:tr>
+        <w:tc>
+          <w:tcPr>
+            <w:tcW w:type="dxa" w:w="2550"/>
+            <w:vAlign w:val="center"/>
+          </w:tcPr>
+          <w:p>
+            <w:pPr>
+              <w:jc w:val="center"/>
+            </w:pPr>
+            <w:r/>
+            <w:r>
+              <w:rPr>
+                <w:rFonts w:ascii="Arial" w:hAnsi="Arial" w:eastAsia="Microsoft YaHei"/>
+                <w:b w:val="0"/>
+                <w:sz w:val="16"/>
+              </w:rPr>
+              <w:t>终止回放</w:t>
+            </w:r>
+          </w:p>
+        </w:tc>
+        <w:tc>
+          <w:tcPr>
+            <w:tcW w:type="dxa" w:w="2550"/>
+            <w:vAlign w:val="center"/>
+          </w:tcPr>
+          <w:p>
+            <w:pPr>
+              <w:jc w:val="center"/>
+            </w:pPr>
+            <w:r/>
+            <w:r>
+              <w:rPr>
+                <w:rFonts w:ascii="Arial" w:hAnsi="Arial" w:eastAsia="Microsoft YaHei"/>
+                <w:b w:val="0"/>
+                <w:sz w:val="16"/>
+              </w:rPr>
+              <w:t>普通随机回放</w:t>
+            </w:r>
+          </w:p>
+        </w:tc>
+        <w:tc>
+          <w:tcPr>
+            <w:tcW w:type="dxa" w:w="2550"/>
+            <w:vAlign w:val="center"/>
+          </w:tcPr>
+          <w:p>
+            <w:pPr>
+              <w:jc w:val="center"/>
+            </w:pPr>
+            <w:r/>
+            <w:r>
+              <w:rPr>
+                <w:rFonts w:ascii="Arial" w:hAnsi="Arial" w:eastAsia="Microsoft YaHei"/>
+                <w:b w:val="0"/>
+                <w:sz w:val="16"/>
+              </w:rPr>
+              <w:t>至少25%终止样本</w:t>
+              <w:br/>
+              <w:t>--sac_terminal_sample_fraction 0.25</w:t>
+            </w:r>
+          </w:p>
+        </w:tc>
+        <w:tc>
+          <w:tcPr>
+            <w:tcW w:type="dxa" w:w="2550"/>
+            <w:vAlign w:val="center"/>
+          </w:tcPr>
+          <w:p>
+            <w:pPr>
+              <w:jc w:val="center"/>
+            </w:pPr>
+            <w:r/>
+            <w:r>
+              <w:rPr>
+                <w:rFonts w:ascii="Arial" w:hAnsi="Arial" w:eastAsia="Microsoft YaHei"/>
+                <w:b w:val="0"/>
+                <w:sz w:val="16"/>
+              </w:rPr>
+              <w:t>提高成功、破损和超时信号在SAC batch中的比例</w:t>
+            </w:r>
+          </w:p>
+        </w:tc>
+      </w:tr>
+      <w:tr>
+        <w:tc>
+          <w:tcPr>
+            <w:tcW w:type="dxa" w:w="2550"/>
+            <w:vAlign w:val="center"/>
+          </w:tcPr>
+          <w:p>
+            <w:pPr>
+              <w:jc w:val="center"/>
+            </w:pPr>
+            <w:r/>
+            <w:r>
+              <w:rPr>
+                <w:rFonts w:ascii="Arial" w:hAnsi="Arial" w:eastAsia="Microsoft YaHei"/>
+                <w:b w:val="0"/>
+                <w:sz w:val="16"/>
+              </w:rPr>
+              <w:t>SAC折扣</w:t>
+            </w:r>
+          </w:p>
+        </w:tc>
+        <w:tc>
+          <w:tcPr>
+            <w:tcW w:type="dxa" w:w="2550"/>
+            <w:vAlign w:val="center"/>
+          </w:tcPr>
+          <w:p>
+            <w:pPr>
+              <w:jc w:val="center"/>
+            </w:pPr>
+            <w:r/>
+            <w:r>
+              <w:rPr>
+                <w:rFonts w:ascii="Arial" w:hAnsi="Arial" w:eastAsia="Microsoft YaHei"/>
+                <w:b w:val="0"/>
+                <w:sz w:val="16"/>
+              </w:rPr>
+              <w:t>0.95</w:t>
+            </w:r>
+          </w:p>
+        </w:tc>
+        <w:tc>
+          <w:tcPr>
+            <w:tcW w:type="dxa" w:w="2550"/>
+            <w:vAlign w:val="center"/>
+          </w:tcPr>
+          <w:p>
+            <w:pPr>
+              <w:jc w:val="center"/>
+            </w:pPr>
+            <w:r/>
+            <w:r>
+              <w:rPr>
+                <w:rFonts w:ascii="Arial" w:hAnsi="Arial" w:eastAsia="Microsoft YaHei"/>
+                <w:b w:val="0"/>
+                <w:sz w:val="16"/>
+              </w:rPr>
+              <w:t>0.99</w:t>
+            </w:r>
+          </w:p>
+        </w:tc>
+        <w:tc>
+          <w:tcPr>
+            <w:tcW w:type="dxa" w:w="2550"/>
+            <w:vAlign w:val="center"/>
+          </w:tcPr>
+          <w:p>
+            <w:pPr>
+              <w:jc w:val="center"/>
+            </w:pPr>
+            <w:r/>
+            <w:r>
+              <w:rPr>
+                <w:rFonts w:ascii="Arial" w:hAnsi="Arial" w:eastAsia="Microsoft YaHei"/>
+                <w:b w:val="0"/>
+                <w:sz w:val="16"/>
+              </w:rPr>
+              <w:t>减少宏动作折扣造成的远期成功信号衰减</w:t>
+            </w:r>
+          </w:p>
+        </w:tc>
+      </w:tr>
+      <w:tr>
+        <w:tc>
+          <w:tcPr>
+            <w:tcW w:type="dxa" w:w="2550"/>
+            <w:vAlign w:val="center"/>
+          </w:tcPr>
+          <w:p>
+            <w:pPr>
+              <w:jc w:val="center"/>
+            </w:pPr>
+            <w:r/>
+            <w:r>
+              <w:rPr>
+                <w:rFonts w:ascii="Arial" w:hAnsi="Arial" w:eastAsia="Microsoft YaHei"/>
+                <w:b w:val="0"/>
+                <w:sz w:val="16"/>
+              </w:rPr>
+              <w:t>超时惩罚</w:t>
+            </w:r>
+          </w:p>
+        </w:tc>
+        <w:tc>
+          <w:tcPr>
+            <w:tcW w:type="dxa" w:w="2550"/>
+            <w:vAlign w:val="center"/>
+          </w:tcPr>
+          <w:p>
+            <w:pPr>
+              <w:jc w:val="center"/>
+            </w:pPr>
+            <w:r/>
+            <w:r>
+              <w:rPr>
+                <w:rFonts w:ascii="Arial" w:hAnsi="Arial" w:eastAsia="Microsoft YaHei"/>
+                <w:b w:val="0"/>
+                <w:sz w:val="16"/>
+              </w:rPr>
+              <w:t>-20</w:t>
+            </w:r>
+          </w:p>
+        </w:tc>
+        <w:tc>
+          <w:tcPr>
+            <w:tcW w:type="dxa" w:w="2550"/>
+            <w:vAlign w:val="center"/>
+          </w:tcPr>
+          <w:p>
+            <w:pPr>
+              <w:jc w:val="center"/>
+            </w:pPr>
+            <w:r/>
+            <w:r>
+              <w:rPr>
+                <w:rFonts w:ascii="Arial" w:hAnsi="Arial" w:eastAsia="Microsoft YaHei"/>
+                <w:b w:val="0"/>
+                <w:sz w:val="16"/>
+              </w:rPr>
+              <w:t>-40</w:t>
+            </w:r>
+          </w:p>
+        </w:tc>
+        <w:tc>
+          <w:tcPr>
+            <w:tcW w:type="dxa" w:w="2550"/>
+            <w:vAlign w:val="center"/>
+          </w:tcPr>
+          <w:p>
+            <w:pPr>
+              <w:jc w:val="center"/>
+            </w:pPr>
+            <w:r/>
+            <w:r>
+              <w:rPr>
+                <w:rFonts w:ascii="Arial" w:hAnsi="Arial" w:eastAsia="Microsoft YaHei"/>
+                <w:b w:val="0"/>
+                <w:sz w:val="16"/>
+              </w:rPr>
+              <w:t>降低通过等待到超时获得相对安全回报的倾向</w:t>
+            </w:r>
+          </w:p>
+        </w:tc>
+      </w:tr>
+      <w:tr>
+        <w:tc>
+          <w:tcPr>
+            <w:tcW w:type="dxa" w:w="2550"/>
+            <w:vAlign w:val="center"/>
+          </w:tcPr>
+          <w:p>
+            <w:pPr>
+              <w:jc w:val="center"/>
+            </w:pPr>
+            <w:r/>
+            <w:r>
+              <w:rPr>
+                <w:rFonts w:ascii="Arial" w:hAnsi="Arial" w:eastAsia="Microsoft YaHei"/>
+                <w:b w:val="0"/>
+                <w:sz w:val="16"/>
+              </w:rPr>
+              <w:t>晚期无进展</w:t>
+            </w:r>
+          </w:p>
+        </w:tc>
+        <w:tc>
+          <w:tcPr>
+            <w:tcW w:type="dxa" w:w="2550"/>
+            <w:vAlign w:val="center"/>
+          </w:tcPr>
+          <w:p>
+            <w:pPr>
+              <w:jc w:val="center"/>
+            </w:pPr>
+            <w:r/>
+            <w:r>
+              <w:rPr>
+                <w:rFonts w:ascii="Arial" w:hAnsi="Arial" w:eastAsia="Microsoft YaHei"/>
+                <w:b w:val="0"/>
+                <w:sz w:val="16"/>
+              </w:rPr>
+              <w:t>未启用或为0</w:t>
+            </w:r>
+          </w:p>
+        </w:tc>
+        <w:tc>
+          <w:tcPr>
+            <w:tcW w:type="dxa" w:w="2550"/>
+            <w:vAlign w:val="center"/>
+          </w:tcPr>
+          <w:p>
+            <w:pPr>
+              <w:jc w:val="center"/>
+            </w:pPr>
+            <w:r/>
+            <w:r>
+              <w:rPr>
+                <w:rFonts w:ascii="Arial" w:hAnsi="Arial" w:eastAsia="Microsoft YaHei"/>
+                <w:b w:val="0"/>
+                <w:sz w:val="16"/>
+              </w:rPr>
+              <w:t>系数0.25，进度50%后递增</w:t>
+            </w:r>
+          </w:p>
+        </w:tc>
+        <w:tc>
+          <w:tcPr>
+            <w:tcW w:type="dxa" w:w="2550"/>
+            <w:vAlign w:val="center"/>
+          </w:tcPr>
+          <w:p>
+            <w:pPr>
+              <w:jc w:val="center"/>
+            </w:pPr>
+            <w:r/>
+            <w:r>
+              <w:rPr>
+                <w:rFonts w:ascii="Arial" w:hAnsi="Arial" w:eastAsia="Microsoft YaHei"/>
+                <w:b w:val="0"/>
+                <w:sz w:val="16"/>
+              </w:rPr>
+              <w:t>对已经接触但长期没有抬升进展的轨迹施加压力</w:t>
+            </w:r>
+          </w:p>
+        </w:tc>
+      </w:tr>
+      <w:tr>
+        <w:tc>
+          <w:tcPr>
+            <w:tcW w:type="dxa" w:w="2550"/>
+            <w:vAlign w:val="center"/>
+          </w:tcPr>
+          <w:p>
+            <w:pPr>
+              <w:jc w:val="center"/>
+            </w:pPr>
+            <w:r/>
+            <w:r>
+              <w:rPr>
+                <w:rFonts w:ascii="Arial" w:hAnsi="Arial" w:eastAsia="Microsoft YaHei"/>
+                <w:b w:val="0"/>
+                <w:sz w:val="16"/>
+              </w:rPr>
+              <w:t>门控范围/初值</w:t>
+            </w:r>
+          </w:p>
+        </w:tc>
+        <w:tc>
+          <w:tcPr>
+            <w:tcW w:type="dxa" w:w="2550"/>
+            <w:vAlign w:val="center"/>
+          </w:tcPr>
+          <w:p>
+            <w:pPr>
+              <w:jc w:val="center"/>
+            </w:pPr>
+            <w:r/>
+            <w:r>
+              <w:rPr>
+                <w:rFonts w:ascii="Arial" w:hAnsi="Arial" w:eastAsia="Microsoft YaHei"/>
+                <w:b w:val="0"/>
+                <w:sz w:val="16"/>
+              </w:rPr>
+              <w:t>init=0.01，max=0.35，penalty=0.1</w:t>
+            </w:r>
+          </w:p>
+        </w:tc>
+        <w:tc>
+          <w:tcPr>
+            <w:tcW w:type="dxa" w:w="2550"/>
+            <w:vAlign w:val="center"/>
+          </w:tcPr>
+          <w:p>
+            <w:pPr>
+              <w:jc w:val="center"/>
+            </w:pPr>
+            <w:r/>
+            <w:r>
+              <w:rPr>
+                <w:rFonts w:ascii="Arial" w:hAnsi="Arial" w:eastAsia="Microsoft YaHei"/>
+                <w:b w:val="0"/>
+                <w:sz w:val="16"/>
+              </w:rPr>
+              <w:t>init=0.025，min=0.02，max=0.20，penalty=5</w:t>
+            </w:r>
+          </w:p>
+        </w:tc>
+        <w:tc>
+          <w:tcPr>
+            <w:tcW w:type="dxa" w:w="2550"/>
+            <w:vAlign w:val="center"/>
+          </w:tcPr>
+          <w:p>
+            <w:pPr>
+              <w:jc w:val="center"/>
+            </w:pPr>
+            <w:r/>
+            <w:r>
+              <w:rPr>
+                <w:rFonts w:ascii="Arial" w:hAnsi="Arial" w:eastAsia="Microsoft YaHei"/>
+                <w:b w:val="0"/>
+                <w:sz w:val="16"/>
+              </w:rPr>
+              <w:t>让残差从接近BC开始，并限制早期修正幅度</w:t>
+            </w:r>
+          </w:p>
+        </w:tc>
+      </w:tr>
+      <w:tr>
+        <w:tc>
+          <w:tcPr>
+            <w:tcW w:type="dxa" w:w="2550"/>
+            <w:vAlign w:val="center"/>
+          </w:tcPr>
+          <w:p>
+            <w:pPr>
+              <w:jc w:val="center"/>
+            </w:pPr>
+            <w:r/>
+            <w:r>
+              <w:rPr>
+                <w:rFonts w:ascii="Arial" w:hAnsi="Arial" w:eastAsia="Microsoft YaHei"/>
+                <w:b w:val="0"/>
+                <w:sz w:val="16"/>
+              </w:rPr>
+              <w:t>其余控制</w:t>
+            </w:r>
+          </w:p>
+        </w:tc>
+        <w:tc>
+          <w:tcPr>
+            <w:tcW w:type="dxa" w:w="2550"/>
+            <w:vAlign w:val="center"/>
+          </w:tcPr>
+          <w:p>
+            <w:pPr>
+              <w:jc w:val="center"/>
+            </w:pPr>
+            <w:r/>
+            <w:r>
+              <w:rPr>
+                <w:rFonts w:ascii="Arial" w:hAnsi="Arial" w:eastAsia="Microsoft YaHei"/>
+                <w:b w:val="0"/>
+                <w:sz w:val="16"/>
+              </w:rPr>
+              <w:t>action_repeat=2，chunk=16，4段物理残差</w:t>
+            </w:r>
+          </w:p>
+        </w:tc>
+        <w:tc>
+          <w:tcPr>
+            <w:tcW w:type="dxa" w:w="2550"/>
+            <w:vAlign w:val="center"/>
+          </w:tcPr>
+          <w:p>
+            <w:pPr>
+              <w:jc w:val="center"/>
+            </w:pPr>
+            <w:r/>
+            <w:r>
+              <w:rPr>
+                <w:rFonts w:ascii="Arial" w:hAnsi="Arial" w:eastAsia="Microsoft YaHei"/>
+                <w:b w:val="0"/>
+                <w:sz w:val="16"/>
+              </w:rPr>
+              <w:t>保持一致</w:t>
+            </w:r>
+          </w:p>
+        </w:tc>
+        <w:tc>
+          <w:tcPr>
+            <w:tcW w:type="dxa" w:w="2550"/>
+            <w:vAlign w:val="center"/>
+          </w:tcPr>
+          <w:p>
+            <w:pPr>
+              <w:jc w:val="center"/>
+            </w:pPr>
+            <w:r/>
+            <w:r>
+              <w:rPr>
+                <w:rFonts w:ascii="Arial" w:hAnsi="Arial" w:eastAsia="Microsoft YaHei"/>
+                <w:b w:val="0"/>
+                <w:sz w:val="16"/>
+              </w:rPr>
+              <w:t>隔离变量，确保差异主要来自终止、回放、奖励和门控设置</w:t>
+            </w:r>
+          </w:p>
+        </w:tc>
+      </w:tr>
+    </w:tbl>
+    <w:p>
+      <w:pPr>
+        <w:spacing w:after="50" w:line="276" w:lineRule="auto"/>
+        <w:ind w:left="113"/>
+      </w:pPr>
+      <w:r>
+        <w:rPr>
+          <w:rFonts w:ascii="Arial" w:hAnsi="Arial" w:eastAsia="Microsoft YaHei"/>
+          <w:sz w:val="21"/>
+        </w:rPr>
+        <w:t>• 训练3的设计目标是同时解决三类问题：超时自动reset导致的错误价值自举、终止失败样本过少，以及单一门控过大导致的残差不稳定。它并没有改变4 N破碎阈值，也没有解冻BC。</w:t>
+      </w:r>
+    </w:p>
+    <w:p>
+      <w:pPr>
+        <w:spacing w:before="100" w:after="80"/>
+      </w:pPr>
+      <w:r>
+        <w:rPr>
+          <w:rFonts w:ascii="Arial" w:hAnsi="Arial" w:eastAsia="Microsoft YaHei"/>
+          <w:b/>
+          <w:color w:val="2F5496"/>
+          <w:sz w:val="24"/>
+        </w:rPr>
+        <w:t>2.4 三组训练数据</w:t>
       </w:r>
     </w:p>
     <w:tbl>
@@ -1053,7 +1775,7 @@
           <w:color w:val="2F5496"/>
           <w:sz w:val="24"/>
         </w:rPr>
-        <w:t>2.4 训练趋势与诊断</w:t>
+        <w:t>2.5 训练趋势与诊断</w:t>
       </w:r>
     </w:p>
     <w:p>

</xml_diff>

<commit_message>
docs: describe visual DSRL inputs
</commit_message>
<xml_diff>
--- a/weekly_report_2026-08-26/TacEx_weekly_report_2026-08-20_to_2026-08-26.docx
+++ b/weekly_report_2026-08-26/TacEx_weekly_report_2026-08-20_to_2026-08-26.docx
@@ -199,7 +199,86 @@
           <w:color w:val="2F5496"/>
           <w:sz w:val="24"/>
         </w:rPr>
-        <w:t>2.2 DSRL/SAC结构与本周改动</w:t>
+        <w:t>2.2 视觉输入改动</w:t>
+      </w:r>
+    </w:p>
+    <w:p>
+      <w:pPr>
+        <w:spacing w:after="50" w:line="276" w:lineRule="auto"/>
+        <w:ind w:left="113"/>
+      </w:pPr>
+      <w:r>
+        <w:rPr>
+          <w:rFonts w:ascii="Arial" w:hAnsi="Arial" w:eastAsia="Microsoft YaHei"/>
+          <w:sz w:val="21"/>
+        </w:rPr>
+        <w:t>• 冻结BC和DSRL统一使用两路相机：腕部RGB与第三视角RGB；每路保留2帧历史并调整为224×224，连同机器人状态和phase输入同一个BC视觉编码器。</w:t>
+      </w:r>
+    </w:p>
+    <w:p>
+      <w:pPr>
+        <w:spacing w:after="50" w:line="276" w:lineRule="auto"/>
+        <w:ind w:left="113"/>
+      </w:pPr>
+      <w:r>
+        <w:rPr>
+          <w:rFonts w:ascii="Arial" w:hAnsi="Arial" w:eastAsia="Microsoft YaHei"/>
+          <w:sz w:val="21"/>
+        </w:rPr>
+        <w:t>• DSRL不再使用relative_object_pos、object_rot6d等仿真物体真值。SAC接收冻结BC encoder产生的global_cond，因此视觉信息来自与BC完全相同的可观测图像和机器人本体状态。</w:t>
+      </w:r>
+    </w:p>
+    <w:p>
+      <w:pPr>
+        <w:spacing w:after="50" w:line="276" w:lineRule="auto"/>
+        <w:ind w:left="113"/>
+      </w:pPr>
+      <w:r>
+        <w:rPr>
+          <w:rFonts w:ascii="Arial" w:hAnsi="Arial" w:eastAsia="Microsoft YaHei"/>
+          <w:sz w:val="21"/>
+        </w:rPr>
+        <w:t>• 新增独立VisualPoseProbe：从冻结BC的图像token池化特征和当前机器人状态推断归一化相对位置3维、相对旋转rot6d 6维及1维置信度，共10维；probe的仿真位姿只在离线训练时作为监督标签，运行时输入只有图像和机器人状态。</w:t>
+      </w:r>
+    </w:p>
+    <w:p>
+      <w:pPr>
+        <w:spacing w:after="50" w:line="276" w:lineRule="auto"/>
+        <w:ind w:left="113"/>
+      </w:pPr>
+      <w:r>
+        <w:rPr>
+          <w:rFonts w:ascii="Arial" w:hAnsi="Arial" w:eastAsia="Microsoft YaHei"/>
+          <w:sz w:val="21"/>
+        </w:rPr>
+        <w:t>• 在物理残差模式下，probe输出的位姿前9维按置信度缩放，置信度作为最后一维保留；该10维视觉位姿摘要与BC编码、4段BC动作摘要和剩余时间一起提供给SAC。</w:t>
+      </w:r>
+    </w:p>
+    <w:p>
+      <w:pPr>
+        <w:spacing w:after="50" w:line="276" w:lineRule="auto"/>
+        <w:ind w:left="113"/>
+      </w:pPr>
+      <w:r>
+        <w:rPr>
+          <w:rFonts w:ascii="Arial" w:hAnsi="Arial" w:eastAsia="Microsoft YaHei"/>
+          <w:sz w:val="21"/>
+        </w:rPr>
+        <w:t>• 视觉旋转头预测的rot6d直接写入BC动作执行链路；DSRL只在此动作上学习物理残差，不再用ground-truth物体朝向或脚本yaw替换BC旋转。</w:t>
+      </w:r>
+    </w:p>
+    <w:p>
+      <w:pPr>
+        <w:spacing w:before="100" w:after="80"/>
+      </w:pPr>
+      <w:r>
+        <w:rPr>
+          <w:rFonts w:ascii="Arial" w:hAnsi="Arial" w:eastAsia="Microsoft YaHei"/>
+          <w:b/>
+          <w:color w:val="2F5496"/>
+          <w:sz w:val="24"/>
+        </w:rPr>
+        <w:t>2.3 DSRL/SAC结构与本周改动</w:t>
       </w:r>
     </w:p>
     <w:p>
@@ -278,7 +357,7 @@
           <w:color w:val="2F5496"/>
           <w:sz w:val="24"/>
         </w:rPr>
-        <w:t>2.3 训练3相对前两条的具体改动</w:t>
+        <w:t>2.4 训练3相对前两条的具体改动</w:t>
       </w:r>
     </w:p>
     <w:p>
@@ -1000,7 +1079,7 @@
           <w:color w:val="2F5496"/>
           <w:sz w:val="24"/>
         </w:rPr>
-        <w:t>2.4 三组训练数据</w:t>
+        <w:t>2.5 三组训练数据</w:t>
       </w:r>
     </w:p>
     <w:tbl>
@@ -1775,7 +1854,7 @@
           <w:color w:val="2F5496"/>
           <w:sz w:val="24"/>
         </w:rPr>
-        <w:t>2.5 训练趋势与诊断</w:t>
+        <w:t>2.6 训练趋势与诊断</w:t>
       </w:r>
     </w:p>
     <w:p>

</xml_diff>